<commit_message>
Prohibit welded joints explicitly; name attendees in minutes
Checklist: one-piece/no-weld becomes an absolute condition — any welded
joint rejects the whole lot; verification via full-length UT on all
pieces with X-ray photos on lot samples to balance supplier cost.
Minutes: attendees now name Lawrence Fang, the plant manager, and
Mr. Guo of CODO International as DOHO's partner.

Co-Authored-By: Claude Fable 5 <noreply@anthropic.com>
Claude-Session: https://claude.ai/code/session_01D8V4YsNDSgybhuKSqPBmt4
</commit_message>
<xml_diff>
--- a/docs/shandong-botong/Botong_Visit_Meeting_Minutes.docx
+++ b/docs/shandong-botong/Botong_Visit_Meeting_Minutes.docx
@@ -285,7 +285,7 @@
                 <w:sz w:val="19"/>
                 <w:szCs w:val="19"/>
               </w:rPr>
-              <w:t xml:space="preserve">艾广远 (Ai Guangyuan) 회장(董事长, 법정대표인) 외 임원, Lawrence (Sales Manager)</w:t>
+              <w:t xml:space="preserve">艾广远 (Ai Guangyuan) 회장(董事长, 법정대표인), Lawrence Fang (方广远, 담당 영업 Sales Manager), 공장장 [성함] 외 임원</w:t>
             </w:r>
           </w:p>
         </w:tc>
@@ -339,7 +339,7 @@
                 <w:sz w:val="19"/>
                 <w:szCs w:val="19"/>
               </w:rPr>
-              <w:t xml:space="preserve">DOHO CO., LTD. [참석자명], 기술 협력 파트너 Mr. Guo</w:t>
+              <w:t xml:space="preserve">DOHO CO., LTD. [참석자명] / CODO International — Mr. Guo (협력 파트너)</w:t>
             </w:r>
           </w:p>
         </w:tc>
@@ -1052,6 +1052,25 @@
           <w:szCs w:val="20"/>
         </w:rPr>
         <w:t xml:space="preserve">적합성 증서(CoC): 당사 발주 스펙(6061-T6, 450×30×3000 / 460×8×3000) 명기, 발급일·만료일 표기, 연 1회 갱신 기준으로 재발행.</w:t>
+      </w:r>
+    </w:p>
+    <w:p>
+      <w:pPr>
+        <w:pStyle w:val="ListParagraph"/>
+        <w:numPr>
+          <w:ilvl w:val="0"/>
+          <w:numId w:val="3"/>
+        </w:numPr>
+        <w:spacing w:after="55"/>
+      </w:pPr>
+      <w:r>
+        <w:rPr>
+          <w:b/>
+          <w:bCs/>
+          <w:sz w:val="20"/>
+          <w:szCs w:val="20"/>
+        </w:rPr>
+        <w:t xml:space="preserve">무용접 단일피스: 1m 등 단관을 용접·접합하여 전장을 구성하는 것은 절대 불가함을 명시 — 전장 UT 스캔(전수) 및 X-ray 사진(로트당 샘플)으로 확인 가능하도록 요청.</w:t>
       </w:r>
     </w:p>
     <w:p>

</xml_diff>

<commit_message>
Embed site-visit photos in the meeting minutes
Appends eight captioned photos from the 2026-08-11 visit — led by the
2,500t extrusion line, plus the 1,400t line, post-extrusion line,
profile workshop, small- and large-diameter tube stock, a billet
origin label, and the attendee group photo.

Co-Authored-By: Claude Fable 5 <noreply@anthropic.com>
Claude-Session: https://claude.ai/code/session_01D8V4YsNDSgybhuKSqPBmt4
</commit_message>
<xml_diff>
--- a/docs/shandong-botong/Botong_Visit_Meeting_Minutes.docx
+++ b/docs/shandong-botong/Botong_Visit_Meeting_Minutes.docx
@@ -1736,18 +1736,624 @@
     </w:p>
     <w:p>
       <w:pPr>
-        <w:spacing w:after="0"/>
-        <w:jc w:val="right"/>
-      </w:pPr>
-      <w:r>
-        <w:rPr>
-          <w:color w:val="6A8898"/>
-          <w:sz w:val="19"/>
-          <w:szCs w:val="19"/>
-        </w:rPr>
-        <w:t xml:space="preserve">별첨: 방문 사진(공장 생산라인·설비·재고), 공급사 명함 사본</w:t>
-      </w:r>
-    </w:p>
+        <w:pStyle w:val="Heading1"/>
+        <w:pBdr>
+          <w:bottom w:val="single" w:color="5A9A96" w:sz="4"/>
+        </w:pBdr>
+        <w:spacing w:after="110" w:before="280"/>
+      </w:pPr>
+      <w:r>
+        <w:rPr>
+          <w:b/>
+          <w:bCs/>
+          <w:color w:val="2E5878"/>
+          <w:sz w:val="24"/>
+          <w:szCs w:val="24"/>
+        </w:rPr>
+        <w:t xml:space="preserve">별첨. 방문 사진 (2026-08-11 촬영)</w:t>
+      </w:r>
+    </w:p>
+    <w:tbl>
+      <w:tblPr>
+        <w:tblW w:type="dxa" w:w="9306"/>
+        <w:tblBorders>
+          <w:top w:val="single" w:color="auto" w:sz="4"/>
+          <w:left w:val="single" w:color="auto" w:sz="4"/>
+          <w:bottom w:val="single" w:color="auto" w:sz="4"/>
+          <w:right w:val="single" w:color="auto" w:sz="4"/>
+          <w:insideH w:val="single" w:color="auto" w:sz="4"/>
+          <w:insideV w:val="single" w:color="auto" w:sz="4"/>
+        </w:tblBorders>
+      </w:tblPr>
+      <w:tblGrid>
+        <w:gridCol w:w="4653"/>
+        <w:gridCol w:w="4653"/>
+      </w:tblGrid>
+      <w:tr>
+        <w:tc>
+          <w:tcPr>
+            <w:tcW w:type="dxa" w:w="4653"/>
+            <w:tcMar>
+              <w:top w:type="dxa" w:w="80"/>
+              <w:left w:type="dxa" w:w="80"/>
+              <w:bottom w:type="dxa" w:w="80"/>
+              <w:right w:type="dxa" w:w="80"/>
+            </w:tcMar>
+            <w:vAlign w:val="center"/>
+          </w:tcPr>
+          <w:p>
+            <w:pPr>
+              <w:spacing w:after="40"/>
+              <w:jc w:val="center"/>
+            </w:pPr>
+            <w:r>
+              <w:drawing>
+                <wp:inline distT="0" distB="0" distL="0" distR="0">
+                  <wp:extent cx="2857500" cy="2143125"/>
+                  <wp:effectExtent t="0" r="0" b="0" l="0"/>
+                  <wp:docPr id="1" name="" descr="" title=""/>
+                  <wp:cNvGraphicFramePr>
+                    <a:graphicFrameLocks xmlns:a="http://schemas.openxmlformats.org/drawingml/2006/main" noChangeAspect="1"/>
+                  </wp:cNvGraphicFramePr>
+                  <a:graphic xmlns:a="http://schemas.openxmlformats.org/drawingml/2006/main">
+                    <a:graphicData uri="http://schemas.openxmlformats.org/drawingml/2006/picture">
+                      <pic:pic xmlns:pic="http://schemas.openxmlformats.org/drawingml/2006/picture">
+                        <pic:nvPicPr>
+                          <pic:cNvPr id="0" name="" descr=""/>
+                          <pic:cNvPicPr>
+                            <a:picLocks noChangeAspect="1" noChangeArrowheads="1"/>
+                          </pic:cNvPicPr>
+                        </pic:nvPicPr>
+                        <pic:blipFill>
+                          <a:blip r:embed="rId7" cstate="none"/>
+                          <a:srcRect/>
+                          <a:stretch>
+                            <a:fillRect/>
+                          </a:stretch>
+                        </pic:blipFill>
+                        <pic:spPr bwMode="auto">
+                          <a:xfrm>
+                            <a:off x="0" y="0"/>
+                            <a:ext cx="2857500" cy="2143125"/>
+                          </a:xfrm>
+                          <a:prstGeom prst="rect">
+                            <a:avLst/>
+                          </a:prstGeom>
+                        </pic:spPr>
+                      </pic:pic>
+                    </a:graphicData>
+                  </a:graphic>
+                </wp:inline>
+              </w:drawing>
+            </w:r>
+          </w:p>
+          <w:p>
+            <w:pPr>
+              <w:spacing w:after="0"/>
+              <w:jc w:val="center"/>
+            </w:pPr>
+            <w:r>
+              <w:rPr>
+                <w:color w:val="555555"/>
+                <w:sz w:val="18"/>
+                <w:szCs w:val="18"/>
+              </w:rPr>
+              <w:t xml:space="preserve">2,500톤급 압출 생산라인 (②号生产线 2500T)</w:t>
+            </w:r>
+          </w:p>
+        </w:tc>
+        <w:tc>
+          <w:tcPr>
+            <w:tcW w:type="dxa" w:w="4653"/>
+            <w:tcMar>
+              <w:top w:type="dxa" w:w="80"/>
+              <w:left w:type="dxa" w:w="80"/>
+              <w:bottom w:type="dxa" w:w="80"/>
+              <w:right w:type="dxa" w:w="80"/>
+            </w:tcMar>
+            <w:vAlign w:val="center"/>
+          </w:tcPr>
+          <w:p>
+            <w:pPr>
+              <w:spacing w:after="40"/>
+              <w:jc w:val="center"/>
+            </w:pPr>
+            <w:r>
+              <w:drawing>
+                <wp:inline distT="0" distB="0" distL="0" distR="0">
+                  <wp:extent cx="2857500" cy="2143125"/>
+                  <wp:effectExtent t="0" r="0" b="0" l="0"/>
+                  <wp:docPr id="1" name="" descr="" title=""/>
+                  <wp:cNvGraphicFramePr>
+                    <a:graphicFrameLocks xmlns:a="http://schemas.openxmlformats.org/drawingml/2006/main" noChangeAspect="1"/>
+                  </wp:cNvGraphicFramePr>
+                  <a:graphic xmlns:a="http://schemas.openxmlformats.org/drawingml/2006/main">
+                    <a:graphicData uri="http://schemas.openxmlformats.org/drawingml/2006/picture">
+                      <pic:pic xmlns:pic="http://schemas.openxmlformats.org/drawingml/2006/picture">
+                        <pic:nvPicPr>
+                          <pic:cNvPr id="0" name="" descr=""/>
+                          <pic:cNvPicPr>
+                            <a:picLocks noChangeAspect="1" noChangeArrowheads="1"/>
+                          </pic:cNvPicPr>
+                        </pic:nvPicPr>
+                        <pic:blipFill>
+                          <a:blip r:embed="rId8" cstate="none"/>
+                          <a:srcRect/>
+                          <a:stretch>
+                            <a:fillRect/>
+                          </a:stretch>
+                        </pic:blipFill>
+                        <pic:spPr bwMode="auto">
+                          <a:xfrm>
+                            <a:off x="0" y="0"/>
+                            <a:ext cx="2857500" cy="2143125"/>
+                          </a:xfrm>
+                          <a:prstGeom prst="rect">
+                            <a:avLst/>
+                          </a:prstGeom>
+                        </pic:spPr>
+                      </pic:pic>
+                    </a:graphicData>
+                  </a:graphic>
+                </wp:inline>
+              </w:drawing>
+            </w:r>
+          </w:p>
+          <w:p>
+            <w:pPr>
+              <w:spacing w:after="0"/>
+              <w:jc w:val="center"/>
+            </w:pPr>
+            <w:r>
+              <w:rPr>
+                <w:color w:val="555555"/>
+                <w:sz w:val="18"/>
+                <w:szCs w:val="18"/>
+              </w:rPr>
+              <w:t xml:space="preserve">1,400톤급 압출 생산라인 가동 현장</w:t>
+            </w:r>
+          </w:p>
+        </w:tc>
+      </w:tr>
+      <w:tr>
+        <w:tc>
+          <w:tcPr>
+            <w:tcW w:type="dxa" w:w="4653"/>
+            <w:tcMar>
+              <w:top w:type="dxa" w:w="80"/>
+              <w:left w:type="dxa" w:w="80"/>
+              <w:bottom w:type="dxa" w:w="80"/>
+              <w:right w:type="dxa" w:w="80"/>
+            </w:tcMar>
+            <w:vAlign w:val="center"/>
+          </w:tcPr>
+          <w:p>
+            <w:pPr>
+              <w:spacing w:after="40"/>
+              <w:jc w:val="center"/>
+            </w:pPr>
+            <w:r>
+              <w:drawing>
+                <wp:inline distT="0" distB="0" distL="0" distR="0">
+                  <wp:extent cx="1857375" cy="2476500"/>
+                  <wp:effectExtent t="0" r="0" b="0" l="0"/>
+                  <wp:docPr id="1" name="" descr="" title=""/>
+                  <wp:cNvGraphicFramePr>
+                    <a:graphicFrameLocks xmlns:a="http://schemas.openxmlformats.org/drawingml/2006/main" noChangeAspect="1"/>
+                  </wp:cNvGraphicFramePr>
+                  <a:graphic xmlns:a="http://schemas.openxmlformats.org/drawingml/2006/main">
+                    <a:graphicData uri="http://schemas.openxmlformats.org/drawingml/2006/picture">
+                      <pic:pic xmlns:pic="http://schemas.openxmlformats.org/drawingml/2006/picture">
+                        <pic:nvPicPr>
+                          <pic:cNvPr id="0" name="" descr=""/>
+                          <pic:cNvPicPr>
+                            <a:picLocks noChangeAspect="1" noChangeArrowheads="1"/>
+                          </pic:cNvPicPr>
+                        </pic:nvPicPr>
+                        <pic:blipFill>
+                          <a:blip r:embed="rId9" cstate="none"/>
+                          <a:srcRect/>
+                          <a:stretch>
+                            <a:fillRect/>
+                          </a:stretch>
+                        </pic:blipFill>
+                        <pic:spPr bwMode="auto">
+                          <a:xfrm>
+                            <a:off x="0" y="0"/>
+                            <a:ext cx="1857375" cy="2476500"/>
+                          </a:xfrm>
+                          <a:prstGeom prst="rect">
+                            <a:avLst/>
+                          </a:prstGeom>
+                        </pic:spPr>
+                      </pic:pic>
+                    </a:graphicData>
+                  </a:graphic>
+                </wp:inline>
+              </w:drawing>
+            </w:r>
+          </w:p>
+          <w:p>
+            <w:pPr>
+              <w:spacing w:after="0"/>
+              <w:jc w:val="center"/>
+            </w:pPr>
+            <w:r>
+              <w:rPr>
+                <w:color w:val="555555"/>
+                <w:sz w:val="18"/>
+                <w:szCs w:val="18"/>
+              </w:rPr>
+              <w:t xml:space="preserve">압출 후처리(교정·이송) 라인 전경</w:t>
+            </w:r>
+          </w:p>
+        </w:tc>
+        <w:tc>
+          <w:tcPr>
+            <w:tcW w:type="dxa" w:w="4653"/>
+            <w:tcMar>
+              <w:top w:type="dxa" w:w="80"/>
+              <w:left w:type="dxa" w:w="80"/>
+              <w:bottom w:type="dxa" w:w="80"/>
+              <w:right w:type="dxa" w:w="80"/>
+            </w:tcMar>
+            <w:vAlign w:val="center"/>
+          </w:tcPr>
+          <w:p>
+            <w:pPr>
+              <w:spacing w:after="40"/>
+              <w:jc w:val="center"/>
+            </w:pPr>
+            <w:r>
+              <w:drawing>
+                <wp:inline distT="0" distB="0" distL="0" distR="0">
+                  <wp:extent cx="2857500" cy="2143125"/>
+                  <wp:effectExtent t="0" r="0" b="0" l="0"/>
+                  <wp:docPr id="1" name="" descr="" title=""/>
+                  <wp:cNvGraphicFramePr>
+                    <a:graphicFrameLocks xmlns:a="http://schemas.openxmlformats.org/drawingml/2006/main" noChangeAspect="1"/>
+                  </wp:cNvGraphicFramePr>
+                  <a:graphic xmlns:a="http://schemas.openxmlformats.org/drawingml/2006/main">
+                    <a:graphicData uri="http://schemas.openxmlformats.org/drawingml/2006/picture">
+                      <pic:pic xmlns:pic="http://schemas.openxmlformats.org/drawingml/2006/picture">
+                        <pic:nvPicPr>
+                          <pic:cNvPr id="0" name="" descr=""/>
+                          <pic:cNvPicPr>
+                            <a:picLocks noChangeAspect="1" noChangeArrowheads="1"/>
+                          </pic:cNvPicPr>
+                        </pic:nvPicPr>
+                        <pic:blipFill>
+                          <a:blip r:embed="rId10" cstate="none"/>
+                          <a:srcRect/>
+                          <a:stretch>
+                            <a:fillRect/>
+                          </a:stretch>
+                        </pic:blipFill>
+                        <pic:spPr bwMode="auto">
+                          <a:xfrm>
+                            <a:off x="0" y="0"/>
+                            <a:ext cx="2857500" cy="2143125"/>
+                          </a:xfrm>
+                          <a:prstGeom prst="rect">
+                            <a:avLst/>
+                          </a:prstGeom>
+                        </pic:spPr>
+                      </pic:pic>
+                    </a:graphicData>
+                  </a:graphic>
+                </wp:inline>
+              </w:drawing>
+            </w:r>
+          </w:p>
+          <w:p>
+            <w:pPr>
+              <w:spacing w:after="0"/>
+              <w:jc w:val="center"/>
+            </w:pPr>
+            <w:r>
+              <w:rPr>
+                <w:color w:val="555555"/>
+                <w:sz w:val="18"/>
+                <w:szCs w:val="18"/>
+              </w:rPr>
+              <w:t xml:space="preserve">형재 가공동 전경</w:t>
+            </w:r>
+          </w:p>
+        </w:tc>
+      </w:tr>
+      <w:tr>
+        <w:tc>
+          <w:tcPr>
+            <w:tcW w:type="dxa" w:w="4653"/>
+            <w:tcMar>
+              <w:top w:type="dxa" w:w="80"/>
+              <w:left w:type="dxa" w:w="80"/>
+              <w:bottom w:type="dxa" w:w="80"/>
+              <w:right w:type="dxa" w:w="80"/>
+            </w:tcMar>
+            <w:vAlign w:val="center"/>
+          </w:tcPr>
+          <w:p>
+            <w:pPr>
+              <w:spacing w:after="40"/>
+              <w:jc w:val="center"/>
+            </w:pPr>
+            <w:r>
+              <w:drawing>
+                <wp:inline distT="0" distB="0" distL="0" distR="0">
+                  <wp:extent cx="1857375" cy="2476500"/>
+                  <wp:effectExtent t="0" r="0" b="0" l="0"/>
+                  <wp:docPr id="1" name="" descr="" title=""/>
+                  <wp:cNvGraphicFramePr>
+                    <a:graphicFrameLocks xmlns:a="http://schemas.openxmlformats.org/drawingml/2006/main" noChangeAspect="1"/>
+                  </wp:cNvGraphicFramePr>
+                  <a:graphic xmlns:a="http://schemas.openxmlformats.org/drawingml/2006/main">
+                    <a:graphicData uri="http://schemas.openxmlformats.org/drawingml/2006/picture">
+                      <pic:pic xmlns:pic="http://schemas.openxmlformats.org/drawingml/2006/picture">
+                        <pic:nvPicPr>
+                          <pic:cNvPr id="0" name="" descr=""/>
+                          <pic:cNvPicPr>
+                            <a:picLocks noChangeAspect="1" noChangeArrowheads="1"/>
+                          </pic:cNvPicPr>
+                        </pic:nvPicPr>
+                        <pic:blipFill>
+                          <a:blip r:embed="rId11" cstate="none"/>
+                          <a:srcRect/>
+                          <a:stretch>
+                            <a:fillRect/>
+                          </a:stretch>
+                        </pic:blipFill>
+                        <pic:spPr bwMode="auto">
+                          <a:xfrm>
+                            <a:off x="0" y="0"/>
+                            <a:ext cx="1857375" cy="2476500"/>
+                          </a:xfrm>
+                          <a:prstGeom prst="rect">
+                            <a:avLst/>
+                          </a:prstGeom>
+                        </pic:spPr>
+                      </pic:pic>
+                    </a:graphicData>
+                  </a:graphic>
+                </wp:inline>
+              </w:drawing>
+            </w:r>
+          </w:p>
+          <w:p>
+            <w:pPr>
+              <w:spacing w:after="0"/>
+              <w:jc w:val="center"/>
+            </w:pPr>
+            <w:r>
+              <w:rPr>
+                <w:color w:val="555555"/>
+                <w:sz w:val="18"/>
+                <w:szCs w:val="18"/>
+              </w:rPr>
+              <w:t xml:space="preserve">소구경 관재 재고 (Group A·B 규격대)</w:t>
+            </w:r>
+          </w:p>
+        </w:tc>
+        <w:tc>
+          <w:tcPr>
+            <w:tcW w:type="dxa" w:w="4653"/>
+            <w:tcMar>
+              <w:top w:type="dxa" w:w="80"/>
+              <w:left w:type="dxa" w:w="80"/>
+              <w:bottom w:type="dxa" w:w="80"/>
+              <w:right w:type="dxa" w:w="80"/>
+            </w:tcMar>
+            <w:vAlign w:val="center"/>
+          </w:tcPr>
+          <w:p>
+            <w:pPr>
+              <w:spacing w:after="40"/>
+              <w:jc w:val="center"/>
+            </w:pPr>
+            <w:r>
+              <w:drawing>
+                <wp:inline distT="0" distB="0" distL="0" distR="0">
+                  <wp:extent cx="1857375" cy="2476500"/>
+                  <wp:effectExtent t="0" r="0" b="0" l="0"/>
+                  <wp:docPr id="1" name="" descr="" title=""/>
+                  <wp:cNvGraphicFramePr>
+                    <a:graphicFrameLocks xmlns:a="http://schemas.openxmlformats.org/drawingml/2006/main" noChangeAspect="1"/>
+                  </wp:cNvGraphicFramePr>
+                  <a:graphic xmlns:a="http://schemas.openxmlformats.org/drawingml/2006/main">
+                    <a:graphicData uri="http://schemas.openxmlformats.org/drawingml/2006/picture">
+                      <pic:pic xmlns:pic="http://schemas.openxmlformats.org/drawingml/2006/picture">
+                        <pic:nvPicPr>
+                          <pic:cNvPr id="0" name="" descr=""/>
+                          <pic:cNvPicPr>
+                            <a:picLocks noChangeAspect="1" noChangeArrowheads="1"/>
+                          </pic:cNvPicPr>
+                        </pic:nvPicPr>
+                        <pic:blipFill>
+                          <a:blip r:embed="rId12" cstate="none"/>
+                          <a:srcRect/>
+                          <a:stretch>
+                            <a:fillRect/>
+                          </a:stretch>
+                        </pic:blipFill>
+                        <pic:spPr bwMode="auto">
+                          <a:xfrm>
+                            <a:off x="0" y="0"/>
+                            <a:ext cx="1857375" cy="2476500"/>
+                          </a:xfrm>
+                          <a:prstGeom prst="rect">
+                            <a:avLst/>
+                          </a:prstGeom>
+                        </pic:spPr>
+                      </pic:pic>
+                    </a:graphicData>
+                  </a:graphic>
+                </wp:inline>
+              </w:drawing>
+            </w:r>
+          </w:p>
+          <w:p>
+            <w:pPr>
+              <w:spacing w:after="0"/>
+              <w:jc w:val="center"/>
+            </w:pPr>
+            <w:r>
+              <w:rPr>
+                <w:color w:val="555555"/>
+                <w:sz w:val="18"/>
+                <w:szCs w:val="18"/>
+              </w:rPr>
+              <w:t xml:space="preserve">후벽 대구경 관재 재고</w:t>
+            </w:r>
+          </w:p>
+        </w:tc>
+      </w:tr>
+      <w:tr>
+        <w:tc>
+          <w:tcPr>
+            <w:tcW w:type="dxa" w:w="4653"/>
+            <w:tcMar>
+              <w:top w:type="dxa" w:w="80"/>
+              <w:left w:type="dxa" w:w="80"/>
+              <w:bottom w:type="dxa" w:w="80"/>
+              <w:right w:type="dxa" w:w="80"/>
+            </w:tcMar>
+            <w:vAlign w:val="center"/>
+          </w:tcPr>
+          <w:p>
+            <w:pPr>
+              <w:spacing w:after="40"/>
+              <w:jc w:val="center"/>
+            </w:pPr>
+            <w:r>
+              <w:drawing>
+                <wp:inline distT="0" distB="0" distL="0" distR="0">
+                  <wp:extent cx="1857375" cy="2476500"/>
+                  <wp:effectExtent t="0" r="0" b="0" l="0"/>
+                  <wp:docPr id="1" name="" descr="" title=""/>
+                  <wp:cNvGraphicFramePr>
+                    <a:graphicFrameLocks xmlns:a="http://schemas.openxmlformats.org/drawingml/2006/main" noChangeAspect="1"/>
+                  </wp:cNvGraphicFramePr>
+                  <a:graphic xmlns:a="http://schemas.openxmlformats.org/drawingml/2006/main">
+                    <a:graphicData uri="http://schemas.openxmlformats.org/drawingml/2006/picture">
+                      <pic:pic xmlns:pic="http://schemas.openxmlformats.org/drawingml/2006/picture">
+                        <pic:nvPicPr>
+                          <pic:cNvPr id="0" name="" descr=""/>
+                          <pic:cNvPicPr>
+                            <a:picLocks noChangeAspect="1" noChangeArrowheads="1"/>
+                          </pic:cNvPicPr>
+                        </pic:nvPicPr>
+                        <pic:blipFill>
+                          <a:blip r:embed="rId13" cstate="none"/>
+                          <a:srcRect/>
+                          <a:stretch>
+                            <a:fillRect/>
+                          </a:stretch>
+                        </pic:blipFill>
+                        <pic:spPr bwMode="auto">
+                          <a:xfrm>
+                            <a:off x="0" y="0"/>
+                            <a:ext cx="1857375" cy="2476500"/>
+                          </a:xfrm>
+                          <a:prstGeom prst="rect">
+                            <a:avLst/>
+                          </a:prstGeom>
+                        </pic:spPr>
+                      </pic:pic>
+                    </a:graphicData>
+                  </a:graphic>
+                </wp:inline>
+              </w:drawing>
+            </w:r>
+          </w:p>
+          <w:p>
+            <w:pPr>
+              <w:spacing w:after="0"/>
+              <w:jc w:val="center"/>
+            </w:pPr>
+            <w:r>
+              <w:rPr>
+                <w:color w:val="555555"/>
+                <w:sz w:val="18"/>
+                <w:szCs w:val="18"/>
+              </w:rPr>
+              <w:t xml:space="preserve">원소재 빌렛 라벨 (출처 확인)</w:t>
+            </w:r>
+          </w:p>
+        </w:tc>
+        <w:tc>
+          <w:tcPr>
+            <w:tcW w:type="dxa" w:w="4653"/>
+            <w:tcMar>
+              <w:top w:type="dxa" w:w="80"/>
+              <w:left w:type="dxa" w:w="80"/>
+              <w:bottom w:type="dxa" w:w="80"/>
+              <w:right w:type="dxa" w:w="80"/>
+            </w:tcMar>
+            <w:vAlign w:val="center"/>
+          </w:tcPr>
+          <w:p>
+            <w:pPr>
+              <w:spacing w:after="40"/>
+              <w:jc w:val="center"/>
+            </w:pPr>
+            <w:r>
+              <w:drawing>
+                <wp:inline distT="0" distB="0" distL="0" distR="0">
+                  <wp:extent cx="2857500" cy="2143125"/>
+                  <wp:effectExtent t="0" r="0" b="0" l="0"/>
+                  <wp:docPr id="1" name="" descr="" title=""/>
+                  <wp:cNvGraphicFramePr>
+                    <a:graphicFrameLocks xmlns:a="http://schemas.openxmlformats.org/drawingml/2006/main" noChangeAspect="1"/>
+                  </wp:cNvGraphicFramePr>
+                  <a:graphic xmlns:a="http://schemas.openxmlformats.org/drawingml/2006/main">
+                    <a:graphicData uri="http://schemas.openxmlformats.org/drawingml/2006/picture">
+                      <pic:pic xmlns:pic="http://schemas.openxmlformats.org/drawingml/2006/picture">
+                        <pic:nvPicPr>
+                          <pic:cNvPr id="0" name="" descr=""/>
+                          <pic:cNvPicPr>
+                            <a:picLocks noChangeAspect="1" noChangeArrowheads="1"/>
+                          </pic:cNvPicPr>
+                        </pic:nvPicPr>
+                        <pic:blipFill>
+                          <a:blip r:embed="rId14" cstate="none"/>
+                          <a:srcRect/>
+                          <a:stretch>
+                            <a:fillRect/>
+                          </a:stretch>
+                        </pic:blipFill>
+                        <pic:spPr bwMode="auto">
+                          <a:xfrm>
+                            <a:off x="0" y="0"/>
+                            <a:ext cx="2857500" cy="2143125"/>
+                          </a:xfrm>
+                          <a:prstGeom prst="rect">
+                            <a:avLst/>
+                          </a:prstGeom>
+                        </pic:spPr>
+                      </pic:pic>
+                    </a:graphicData>
+                  </a:graphic>
+                </wp:inline>
+              </w:drawing>
+            </w:r>
+          </w:p>
+          <w:p>
+            <w:pPr>
+              <w:spacing w:after="0"/>
+              <w:jc w:val="center"/>
+            </w:pPr>
+            <w:r>
+              <w:rPr>
+                <w:color w:val="555555"/>
+                <w:sz w:val="18"/>
+                <w:szCs w:val="18"/>
+              </w:rPr>
+              <w:t xml:space="preserve">양사 협의 참석자 (远通集团 본사)</w:t>
+            </w:r>
+          </w:p>
+        </w:tc>
+      </w:tr>
+    </w:tbl>
     <w:sectPr>
       <w:pgSz w:w="11906" w:h="16838" w:orient="portrait"/>
       <w:pgMar w:top="1200" w:right="1300" w:bottom="1200" w:left="1300" w:header="708" w:footer="708" w:gutter="0"/>

</xml_diff>

<commit_message>
Fill in attendee names in the meeting minutes
Co-Authored-By: Claude Fable 5 <noreply@anthropic.com>
Claude-Session: https://claude.ai/code/session_01D8V4YsNDSgybhuKSqPBmt4
</commit_message>
<xml_diff>
--- a/docs/shandong-botong/Botong_Visit_Meeting_Minutes.docx
+++ b/docs/shandong-botong/Botong_Visit_Meeting_Minutes.docx
@@ -285,7 +285,7 @@
                 <w:sz w:val="19"/>
                 <w:szCs w:val="19"/>
               </w:rPr>
-              <w:t xml:space="preserve">艾广远 (Ai Guangyuan) 회장(董事长, 법정대표인), Lawrence Fang (方广远, 담당 영업 Sales Manager), 공장장 [성함] 외 임원</w:t>
+              <w:t xml:space="preserve">艾广远 (Ai Guangyuan) 회장(董事长, 법정대표인), Lawrence Fang (方广远, 담당 영업 Sales Manager), Mr. Wang (공장장) 외 임원</w:t>
             </w:r>
           </w:p>
         </w:tc>
@@ -339,7 +339,7 @@
                 <w:sz w:val="19"/>
                 <w:szCs w:val="19"/>
               </w:rPr>
-              <w:t xml:space="preserve">DOHO CO., LTD. [참석자명] / CODO International — Mr. Guo (협력 파트너)</w:t>
+              <w:t xml:space="preserve">DOHO CO., LTD. 황주호 / CODO International — Mr. Guo (협력 파트너)</w:t>
             </w:r>
           </w:p>
         </w:tc>

</xml_diff>

<commit_message>
Remove recycled-billet remark from customer-facing minutes
Co-Authored-By: Claude Fable 5 <noreply@anthropic.com>
Claude-Session: https://claude.ai/code/session_01D8V4YsNDSgybhuKSqPBmt4
</commit_message>
<xml_diff>
--- a/docs/shandong-botong/Botong_Visit_Meeting_Minutes.docx
+++ b/docs/shandong-botong/Botong_Visit_Meeting_Minutes.docx
@@ -1109,25 +1109,6 @@
           <w:szCs w:val="20"/>
         </w:rPr>
         <w:t xml:space="preserve">영문 회사소개서(연혁·조직·설비·생산능력) 제출.</w:t>
-      </w:r>
-    </w:p>
-    <w:p>
-      <w:pPr>
-        <w:pStyle w:val="ListParagraph"/>
-        <w:numPr>
-          <w:ilvl w:val="0"/>
-          <w:numId w:val="3"/>
-        </w:numPr>
-        <w:spacing w:after="55"/>
-      </w:pPr>
-      <w:r>
-        <w:rPr>
-          <w:b w:val="false"/>
-          <w:bCs w:val="false"/>
-          <w:sz w:val="20"/>
-          <w:szCs w:val="20"/>
-        </w:rPr>
-        <w:t xml:space="preserve">원소재 관리: 공장 내 원소재 빌렛 일부가 재생 빌렛으로 확인되어, 당사 로트에 대해서는 빌렛 출처 및 화학성분(Fe 등 불순물) 관리 내역을 MTC로 검증하기로 함.</w:t>
       </w:r>
     </w:p>
     <w:p>

</xml_diff>